<commit_message>
The new applied changes from Fiona on 30 July 2026
</commit_message>
<xml_diff>
--- a/documents/TCM_documentation Jimmy.docx
+++ b/documents/TCM_documentation Jimmy.docx
@@ -445,6 +445,125 @@
     </w:p>
     <w:p>
       <w:pPr>
+        <w:pStyle w:val="BodyText"/>
+        <w:numPr>
+          <w:ilvl w:val="0"/>
+          <w:numId w:val="0"/>
+        </w:numPr>
+        <w:spacing w:lineRule="auto" w:line="271"/>
+        <w:ind w:hanging="0" w:start="709"/>
+        <w:jc w:val="center"/>
+        <w:rPr>
+          <w:rFonts w:ascii="Liberation Serif" w:hAnsi="Liberation Serif"/>
+        </w:rPr>
+      </w:pPr>
+      <w:r>
+        <w:drawing>
+          <wp:anchor distT="0" distB="0" distL="0" distR="0" simplePos="0" relativeHeight="12" behindDoc="0" locked="0" layoutInCell="0" allowOverlap="1">
+            <wp:simplePos x="0" y="0"/>
+            <wp:positionH relativeFrom="column">
+              <wp:align>center</wp:align>
+            </wp:positionH>
+            <wp:positionV relativeFrom="paragraph">
+              <wp:posOffset>635</wp:posOffset>
+            </wp:positionV>
+            <wp:extent cx="4657725" cy="4980305"/>
+            <wp:effectExtent l="0" t="0" r="0" b="0"/>
+            <wp:wrapTopAndBottom/>
+            <wp:docPr id="1" name="Image10"/>
+            <wp:cNvGraphicFramePr>
+              <a:graphicFrameLocks xmlns:a="http://schemas.openxmlformats.org/drawingml/2006/main" noChangeAspect="1"/>
+            </wp:cNvGraphicFramePr>
+            <a:graphic xmlns:a="http://schemas.openxmlformats.org/drawingml/2006/main">
+              <a:graphicData uri="http://schemas.openxmlformats.org/drawingml/2006/picture">
+                <pic:pic xmlns:pic="http://schemas.openxmlformats.org/drawingml/2006/picture">
+                  <pic:nvPicPr>
+                    <pic:cNvPr id="1" name="Image10"/>
+                    <pic:cNvPicPr>
+                      <a:picLocks noChangeAspect="1" noChangeArrowheads="1"/>
+                    </pic:cNvPicPr>
+                  </pic:nvPicPr>
+                  <pic:blipFill>
+                    <a:blip r:embed="rId2"/>
+                    <a:stretch>
+                      <a:fillRect/>
+                    </a:stretch>
+                  </pic:blipFill>
+                  <pic:spPr bwMode="auto">
+                    <a:xfrm>
+                      <a:off x="0" y="0"/>
+                      <a:ext cx="4657725" cy="4980305"/>
+                    </a:xfrm>
+                    <a:prstGeom prst="rect">
+                      <a:avLst/>
+                    </a:prstGeom>
+                    <a:noFill/>
+                  </pic:spPr>
+                </pic:pic>
+              </a:graphicData>
+            </a:graphic>
+          </wp:anchor>
+        </w:drawing>
+      </w:r>
+      <w:r>
+        <w:rPr>
+          <w:rFonts w:ascii="Liberation Serif" w:hAnsi="Liberation Serif"/>
+        </w:rPr>
+        <w:t xml:space="preserve">Figure </w:t>
+      </w:r>
+      <w:r>
+        <w:rPr>
+          <w:rFonts w:ascii="Liberation Serif" w:hAnsi="Liberation Serif"/>
+        </w:rPr>
+        <w:t>1</w:t>
+      </w:r>
+      <w:r>
+        <w:rPr>
+          <w:rFonts w:ascii="Liberation Serif" w:hAnsi="Liberation Serif"/>
+        </w:rPr>
+        <w:t xml:space="preserve">. </w:t>
+      </w:r>
+      <w:r>
+        <w:rPr>
+          <w:rFonts w:ascii="Liberation Serif" w:hAnsi="Liberation Serif"/>
+        </w:rPr>
+        <w:t>Registration screen.</w:t>
+      </w:r>
+    </w:p>
+    <w:p>
+      <w:pPr>
+        <w:pStyle w:val="BodyText"/>
+        <w:numPr>
+          <w:ilvl w:val="0"/>
+          <w:numId w:val="0"/>
+        </w:numPr>
+        <w:spacing w:lineRule="auto" w:line="271"/>
+        <w:ind w:hanging="0" w:start="709"/>
+        <w:jc w:val="center"/>
+        <w:rPr/>
+      </w:pPr>
+      <w:r>
+        <w:rPr/>
+      </w:r>
+    </w:p>
+    <w:p>
+      <w:pPr>
+        <w:pStyle w:val="BodyText"/>
+        <w:numPr>
+          <w:ilvl w:val="0"/>
+          <w:numId w:val="0"/>
+        </w:numPr>
+        <w:spacing w:lineRule="auto" w:line="271"/>
+        <w:ind w:hanging="0" w:start="709"/>
+        <w:jc w:val="center"/>
+        <w:rPr/>
+      </w:pPr>
+      <w:r>
+        <w:rPr/>
+      </w:r>
+    </w:p>
+    <w:p>
+      <w:pPr>
         <w:pStyle w:val="Heading3"/>
         <w:spacing w:lineRule="auto" w:line="274" w:before="0" w:after="140"/>
         <w:ind w:hanging="0"/>
@@ -672,6 +791,403 @@
     </w:p>
     <w:p>
       <w:pPr>
+        <w:pStyle w:val="Normal"/>
+        <w:ind w:hanging="0" w:start="0"/>
+        <w:jc w:val="center"/>
+        <w:rPr/>
+      </w:pPr>
+      <w:r>
+        <w:drawing>
+          <wp:anchor distT="0" distB="0" distL="0" distR="0" simplePos="0" relativeHeight="13" behindDoc="0" locked="0" layoutInCell="0" allowOverlap="1">
+            <wp:simplePos x="0" y="0"/>
+            <wp:positionH relativeFrom="column">
+              <wp:posOffset>1386840</wp:posOffset>
+            </wp:positionH>
+            <wp:positionV relativeFrom="paragraph">
+              <wp:posOffset>-38100</wp:posOffset>
+            </wp:positionV>
+            <wp:extent cx="4316095" cy="3567430"/>
+            <wp:effectExtent l="0" t="0" r="0" b="0"/>
+            <wp:wrapTopAndBottom/>
+            <wp:docPr id="2" name="Image11"/>
+            <wp:cNvGraphicFramePr>
+              <a:graphicFrameLocks xmlns:a="http://schemas.openxmlformats.org/drawingml/2006/main" noChangeAspect="1"/>
+            </wp:cNvGraphicFramePr>
+            <a:graphic xmlns:a="http://schemas.openxmlformats.org/drawingml/2006/main">
+              <a:graphicData uri="http://schemas.openxmlformats.org/drawingml/2006/picture">
+                <pic:pic xmlns:pic="http://schemas.openxmlformats.org/drawingml/2006/picture">
+                  <pic:nvPicPr>
+                    <pic:cNvPr id="2" name="Image11"/>
+                    <pic:cNvPicPr>
+                      <a:picLocks noChangeAspect="1" noChangeArrowheads="1"/>
+                    </pic:cNvPicPr>
+                  </pic:nvPicPr>
+                  <pic:blipFill>
+                    <a:blip r:embed="rId3"/>
+                    <a:stretch>
+                      <a:fillRect/>
+                    </a:stretch>
+                  </pic:blipFill>
+                  <pic:spPr bwMode="auto">
+                    <a:xfrm>
+                      <a:off x="0" y="0"/>
+                      <a:ext cx="4316095" cy="3567430"/>
+                    </a:xfrm>
+                    <a:prstGeom prst="rect">
+                      <a:avLst/>
+                    </a:prstGeom>
+                    <a:noFill/>
+                  </pic:spPr>
+                </pic:pic>
+              </a:graphicData>
+            </a:graphic>
+          </wp:anchor>
+        </w:drawing>
+      </w:r>
+      <w:r>
+        <w:rPr/>
+        <w:t xml:space="preserve">Figure </w:t>
+      </w:r>
+      <w:r>
+        <w:rPr/>
+        <w:t>1</w:t>
+      </w:r>
+      <w:r>
+        <w:rPr/>
+        <w:t xml:space="preserve">. </w:t>
+      </w:r>
+      <w:r>
+        <w:rPr/>
+        <w:t>Female AI interaction.</w:t>
+      </w:r>
+    </w:p>
+    <w:p>
+      <w:pPr>
+        <w:pStyle w:val="Normal"/>
+        <w:jc w:val="center"/>
+        <w:rPr/>
+      </w:pPr>
+      <w:r>
+        <w:drawing>
+          <wp:anchor distT="0" distB="0" distL="0" distR="0" simplePos="0" relativeHeight="14" behindDoc="0" locked="0" layoutInCell="0" allowOverlap="1">
+            <wp:simplePos x="0" y="0"/>
+            <wp:positionH relativeFrom="column">
+              <wp:align>center</wp:align>
+            </wp:positionH>
+            <wp:positionV relativeFrom="paragraph">
+              <wp:posOffset>635</wp:posOffset>
+            </wp:positionV>
+            <wp:extent cx="6699885" cy="5115560"/>
+            <wp:effectExtent l="0" t="0" r="0" b="0"/>
+            <wp:wrapTopAndBottom/>
+            <wp:docPr id="3" name="Image12"/>
+            <wp:cNvGraphicFramePr>
+              <a:graphicFrameLocks xmlns:a="http://schemas.openxmlformats.org/drawingml/2006/main" noChangeAspect="1"/>
+            </wp:cNvGraphicFramePr>
+            <a:graphic xmlns:a="http://schemas.openxmlformats.org/drawingml/2006/main">
+              <a:graphicData uri="http://schemas.openxmlformats.org/drawingml/2006/picture">
+                <pic:pic xmlns:pic="http://schemas.openxmlformats.org/drawingml/2006/picture">
+                  <pic:nvPicPr>
+                    <pic:cNvPr id="3" name="Image12"/>
+                    <pic:cNvPicPr>
+                      <a:picLocks noChangeAspect="1" noChangeArrowheads="1"/>
+                    </pic:cNvPicPr>
+                  </pic:nvPicPr>
+                  <pic:blipFill>
+                    <a:blip r:embed="rId4"/>
+                    <a:stretch>
+                      <a:fillRect/>
+                    </a:stretch>
+                  </pic:blipFill>
+                  <pic:spPr bwMode="auto">
+                    <a:xfrm>
+                      <a:off x="0" y="0"/>
+                      <a:ext cx="6699885" cy="5115560"/>
+                    </a:xfrm>
+                    <a:prstGeom prst="rect">
+                      <a:avLst/>
+                    </a:prstGeom>
+                    <a:noFill/>
+                  </pic:spPr>
+                </pic:pic>
+              </a:graphicData>
+            </a:graphic>
+          </wp:anchor>
+        </w:drawing>
+      </w:r>
+      <w:r>
+        <w:rPr/>
+        <w:t xml:space="preserve">Figure </w:t>
+      </w:r>
+      <w:r>
+        <w:rPr/>
+        <w:t>1</w:t>
+      </w:r>
+      <w:r>
+        <w:rPr/>
+        <w:t xml:space="preserve">. </w:t>
+      </w:r>
+      <w:r>
+        <w:rPr/>
+        <w:t>Female AI interaction.</w:t>
+      </w:r>
+    </w:p>
+    <w:p>
+      <w:pPr>
+        <w:pStyle w:val="Normal"/>
+        <w:jc w:val="center"/>
+        <w:rPr/>
+      </w:pPr>
+      <w:r>
+        <w:rPr/>
+      </w:r>
+    </w:p>
+    <w:p>
+      <w:pPr>
+        <w:pStyle w:val="Normal"/>
+        <w:jc w:val="center"/>
+        <w:rPr/>
+      </w:pPr>
+      <w:r>
+        <w:drawing>
+          <wp:anchor distT="0" distB="0" distL="0" distR="0" simplePos="0" relativeHeight="15" behindDoc="0" locked="0" layoutInCell="0" allowOverlap="1">
+            <wp:simplePos x="0" y="0"/>
+            <wp:positionH relativeFrom="column">
+              <wp:posOffset>1402715</wp:posOffset>
+            </wp:positionH>
+            <wp:positionV relativeFrom="paragraph">
+              <wp:posOffset>-132715</wp:posOffset>
+            </wp:positionV>
+            <wp:extent cx="4157345" cy="5114925"/>
+            <wp:effectExtent l="0" t="0" r="0" b="0"/>
+            <wp:wrapTopAndBottom/>
+            <wp:docPr id="4" name="Image13"/>
+            <wp:cNvGraphicFramePr>
+              <a:graphicFrameLocks xmlns:a="http://schemas.openxmlformats.org/drawingml/2006/main" noChangeAspect="1"/>
+            </wp:cNvGraphicFramePr>
+            <a:graphic xmlns:a="http://schemas.openxmlformats.org/drawingml/2006/main">
+              <a:graphicData uri="http://schemas.openxmlformats.org/drawingml/2006/picture">
+                <pic:pic xmlns:pic="http://schemas.openxmlformats.org/drawingml/2006/picture">
+                  <pic:nvPicPr>
+                    <pic:cNvPr id="4" name="Image13"/>
+                    <pic:cNvPicPr>
+                      <a:picLocks noChangeAspect="1" noChangeArrowheads="1"/>
+                    </pic:cNvPicPr>
+                  </pic:nvPicPr>
+                  <pic:blipFill>
+                    <a:blip r:embed="rId5"/>
+                    <a:stretch>
+                      <a:fillRect/>
+                    </a:stretch>
+                  </pic:blipFill>
+                  <pic:spPr bwMode="auto">
+                    <a:xfrm>
+                      <a:off x="0" y="0"/>
+                      <a:ext cx="4157345" cy="5114925"/>
+                    </a:xfrm>
+                    <a:prstGeom prst="rect">
+                      <a:avLst/>
+                    </a:prstGeom>
+                    <a:noFill/>
+                  </pic:spPr>
+                </pic:pic>
+              </a:graphicData>
+            </a:graphic>
+          </wp:anchor>
+        </w:drawing>
+        <w:drawing>
+          <wp:anchor distT="0" distB="0" distL="0" distR="0" simplePos="0" relativeHeight="16" behindDoc="0" locked="0" layoutInCell="0" allowOverlap="1">
+            <wp:simplePos x="0" y="0"/>
+            <wp:positionH relativeFrom="column">
+              <wp:align>center</wp:align>
+            </wp:positionH>
+            <wp:positionV relativeFrom="paragraph">
+              <wp:posOffset>635</wp:posOffset>
+            </wp:positionV>
+            <wp:extent cx="4157345" cy="5114925"/>
+            <wp:effectExtent l="0" t="0" r="0" b="0"/>
+            <wp:wrapTopAndBottom/>
+            <wp:docPr id="5" name="Image14"/>
+            <wp:cNvGraphicFramePr>
+              <a:graphicFrameLocks xmlns:a="http://schemas.openxmlformats.org/drawingml/2006/main" noChangeAspect="1"/>
+            </wp:cNvGraphicFramePr>
+            <a:graphic xmlns:a="http://schemas.openxmlformats.org/drawingml/2006/main">
+              <a:graphicData uri="http://schemas.openxmlformats.org/drawingml/2006/picture">
+                <pic:pic xmlns:pic="http://schemas.openxmlformats.org/drawingml/2006/picture">
+                  <pic:nvPicPr>
+                    <pic:cNvPr id="5" name="Image14"/>
+                    <pic:cNvPicPr>
+                      <a:picLocks noChangeAspect="1" noChangeArrowheads="1"/>
+                    </pic:cNvPicPr>
+                  </pic:nvPicPr>
+                  <pic:blipFill>
+                    <a:blip r:embed="rId6"/>
+                    <a:stretch>
+                      <a:fillRect/>
+                    </a:stretch>
+                  </pic:blipFill>
+                  <pic:spPr bwMode="auto">
+                    <a:xfrm>
+                      <a:off x="0" y="0"/>
+                      <a:ext cx="4157345" cy="5114925"/>
+                    </a:xfrm>
+                    <a:prstGeom prst="rect">
+                      <a:avLst/>
+                    </a:prstGeom>
+                    <a:noFill/>
+                  </pic:spPr>
+                </pic:pic>
+              </a:graphicData>
+            </a:graphic>
+          </wp:anchor>
+        </w:drawing>
+        <w:drawing>
+          <wp:anchor distT="0" distB="0" distL="0" distR="0" simplePos="0" relativeHeight="17" behindDoc="0" locked="0" layoutInCell="0" allowOverlap="1">
+            <wp:simplePos x="0" y="0"/>
+            <wp:positionH relativeFrom="column">
+              <wp:posOffset>1254760</wp:posOffset>
+            </wp:positionH>
+            <wp:positionV relativeFrom="paragraph">
+              <wp:posOffset>1066800</wp:posOffset>
+            </wp:positionV>
+            <wp:extent cx="4529455" cy="5059680"/>
+            <wp:effectExtent l="0" t="0" r="0" b="0"/>
+            <wp:wrapTopAndBottom/>
+            <wp:docPr id="6" name="Image15"/>
+            <wp:cNvGraphicFramePr>
+              <a:graphicFrameLocks xmlns:a="http://schemas.openxmlformats.org/drawingml/2006/main" noChangeAspect="1"/>
+            </wp:cNvGraphicFramePr>
+            <a:graphic xmlns:a="http://schemas.openxmlformats.org/drawingml/2006/main">
+              <a:graphicData uri="http://schemas.openxmlformats.org/drawingml/2006/picture">
+                <pic:pic xmlns:pic="http://schemas.openxmlformats.org/drawingml/2006/picture">
+                  <pic:nvPicPr>
+                    <pic:cNvPr id="6" name="Image15"/>
+                    <pic:cNvPicPr>
+                      <a:picLocks noChangeAspect="1" noChangeArrowheads="1"/>
+                    </pic:cNvPicPr>
+                  </pic:nvPicPr>
+                  <pic:blipFill>
+                    <a:blip r:embed="rId7"/>
+                    <a:stretch>
+                      <a:fillRect/>
+                    </a:stretch>
+                  </pic:blipFill>
+                  <pic:spPr bwMode="auto">
+                    <a:xfrm>
+                      <a:off x="0" y="0"/>
+                      <a:ext cx="4529455" cy="5059680"/>
+                    </a:xfrm>
+                    <a:prstGeom prst="rect">
+                      <a:avLst/>
+                    </a:prstGeom>
+                    <a:noFill/>
+                  </pic:spPr>
+                </pic:pic>
+              </a:graphicData>
+            </a:graphic>
+          </wp:anchor>
+        </w:drawing>
+      </w:r>
+      <w:r>
+        <w:rPr/>
+        <w:t xml:space="preserve">Figure </w:t>
+      </w:r>
+      <w:r>
+        <w:rPr/>
+        <w:t>1</w:t>
+      </w:r>
+      <w:r>
+        <w:rPr/>
+        <w:t xml:space="preserve">. </w:t>
+      </w:r>
+      <w:r>
+        <w:rPr/>
+        <w:t>Female AI interaction.</w:t>
+      </w:r>
+    </w:p>
+    <w:p>
+      <w:pPr>
+        <w:pStyle w:val="Normal"/>
+        <w:jc w:val="center"/>
+        <w:rPr/>
+      </w:pPr>
+      <w:r>
+        <w:drawing>
+          <wp:anchor distT="0" distB="0" distL="0" distR="0" simplePos="0" relativeHeight="18" behindDoc="0" locked="0" layoutInCell="0" allowOverlap="1">
+            <wp:simplePos x="0" y="0"/>
+            <wp:positionH relativeFrom="column">
+              <wp:align>center</wp:align>
+            </wp:positionH>
+            <wp:positionV relativeFrom="paragraph">
+              <wp:posOffset>635</wp:posOffset>
+            </wp:positionV>
+            <wp:extent cx="6760845" cy="4157345"/>
+            <wp:effectExtent l="0" t="0" r="0" b="0"/>
+            <wp:wrapSquare wrapText="largest"/>
+            <wp:docPr id="7" name="Image16"/>
+            <wp:cNvGraphicFramePr>
+              <a:graphicFrameLocks xmlns:a="http://schemas.openxmlformats.org/drawingml/2006/main" noChangeAspect="1"/>
+            </wp:cNvGraphicFramePr>
+            <a:graphic xmlns:a="http://schemas.openxmlformats.org/drawingml/2006/main">
+              <a:graphicData uri="http://schemas.openxmlformats.org/drawingml/2006/picture">
+                <pic:pic xmlns:pic="http://schemas.openxmlformats.org/drawingml/2006/picture">
+                  <pic:nvPicPr>
+                    <pic:cNvPr id="7" name="Image16"/>
+                    <pic:cNvPicPr>
+                      <a:picLocks noChangeAspect="1" noChangeArrowheads="1"/>
+                    </pic:cNvPicPr>
+                  </pic:nvPicPr>
+                  <pic:blipFill>
+                    <a:blip r:embed="rId8"/>
+                    <a:stretch>
+                      <a:fillRect/>
+                    </a:stretch>
+                  </pic:blipFill>
+                  <pic:spPr bwMode="auto">
+                    <a:xfrm>
+                      <a:off x="0" y="0"/>
+                      <a:ext cx="6760845" cy="4157345"/>
+                    </a:xfrm>
+                    <a:prstGeom prst="rect">
+                      <a:avLst/>
+                    </a:prstGeom>
+                    <a:noFill/>
+                  </pic:spPr>
+                </pic:pic>
+              </a:graphicData>
+            </a:graphic>
+          </wp:anchor>
+        </w:drawing>
+      </w:r>
+      <w:r>
+        <w:rPr/>
+        <w:t xml:space="preserve">Figure </w:t>
+      </w:r>
+      <w:r>
+        <w:rPr/>
+        <w:t>1</w:t>
+      </w:r>
+      <w:r>
+        <w:rPr/>
+        <w:t xml:space="preserve">. </w:t>
+      </w:r>
+      <w:r>
+        <w:rPr/>
+        <w:t>Female AI interaction.</w:t>
+      </w:r>
+    </w:p>
+    <w:p>
+      <w:pPr>
+        <w:pStyle w:val="Normal"/>
+        <w:jc w:val="center"/>
+        <w:rPr/>
+      </w:pPr>
+      <w:r>
+        <w:rPr/>
+      </w:r>
+    </w:p>
+    <w:p>
+      <w:pPr>
         <w:pStyle w:val="Heading2"/>
         <w:spacing w:lineRule="auto" w:line="274" w:before="0" w:after="140"/>
         <w:rPr>
@@ -871,19 +1387,12 @@
     <w:p>
       <w:pPr>
         <w:pStyle w:val="BodyText"/>
-        <w:tabs>
-          <w:tab w:val="clear" w:pos="709"/>
-          <w:tab w:val="left" w:pos="0" w:leader="none"/>
-        </w:tabs>
-        <w:spacing w:lineRule="auto" w:line="274"/>
-        <w:rPr>
-          <w:rFonts w:ascii="Google Sans Text;sans-serif" w:hAnsi="Google Sans Text;sans-serif"/>
-        </w:rPr>
-      </w:pPr>
-      <w:r>
-        <w:rPr>
-          <w:rFonts w:ascii="Google Sans Text;sans-serif" w:hAnsi="Google Sans Text;sans-serif"/>
-        </w:rPr>
+        <w:spacing w:lineRule="auto" w:line="271"/>
+        <w:ind w:hanging="0"/>
+        <w:jc w:val="center"/>
+        <w:rPr/>
+      </w:pPr>
+      <w:r>
         <w:drawing>
           <wp:anchor distT="0" distB="0" distL="0" distR="0" simplePos="0" relativeHeight="10" behindDoc="0" locked="0" layoutInCell="0" allowOverlap="1">
             <wp:simplePos x="0" y="0"/>
@@ -896,7 +1405,7 @@
             <wp:extent cx="6569710" cy="6667500"/>
             <wp:effectExtent l="0" t="0" r="0" b="0"/>
             <wp:wrapTopAndBottom/>
-            <wp:docPr id="1" name="Image2"/>
+            <wp:docPr id="8" name="Image2"/>
             <wp:cNvGraphicFramePr>
               <a:graphicFrameLocks xmlns:a="http://schemas.openxmlformats.org/drawingml/2006/main" noChangeAspect="1"/>
             </wp:cNvGraphicFramePr>
@@ -904,13 +1413,13 @@
               <a:graphicData uri="http://schemas.openxmlformats.org/drawingml/2006/picture">
                 <pic:pic xmlns:pic="http://schemas.openxmlformats.org/drawingml/2006/picture">
                   <pic:nvPicPr>
-                    <pic:cNvPr id="1" name="Image2"/>
+                    <pic:cNvPr id="8" name="Image2"/>
                     <pic:cNvPicPr>
                       <a:picLocks noChangeAspect="1" noChangeArrowheads="1"/>
                     </pic:cNvPicPr>
                   </pic:nvPicPr>
                   <pic:blipFill>
-                    <a:blip r:embed="rId2"/>
+                    <a:blip r:embed="rId9"/>
                     <a:stretch>
                       <a:fillRect/>
                     </a:stretch>
@@ -931,6 +1440,30 @@
           </wp:anchor>
         </w:drawing>
       </w:r>
+      <w:r>
+        <w:rPr>
+          <w:rFonts w:ascii="Google Sans;sans-serif" w:hAnsi="Google Sans;sans-serif"/>
+        </w:rPr>
+        <w:t xml:space="preserve">Figure </w:t>
+      </w:r>
+      <w:r>
+        <w:rPr>
+          <w:rFonts w:ascii="Google Sans;sans-serif" w:hAnsi="Google Sans;sans-serif"/>
+        </w:rPr>
+        <w:t>1</w:t>
+      </w:r>
+      <w:r>
+        <w:rPr>
+          <w:rFonts w:ascii="Google Sans;sans-serif" w:hAnsi="Google Sans;sans-serif"/>
+        </w:rPr>
+        <w:t xml:space="preserve">. </w:t>
+      </w:r>
+      <w:r>
+        <w:rPr>
+          <w:rFonts w:ascii="Google Sans;sans-serif" w:hAnsi="Google Sans;sans-serif"/>
+        </w:rPr>
+        <w:t>Female AI interaction.</w:t>
+      </w:r>
     </w:p>
     <w:p>
       <w:pPr>
@@ -972,7 +1505,7 @@
             <wp:extent cx="6840220" cy="8222615"/>
             <wp:effectExtent l="0" t="0" r="0" b="0"/>
             <wp:wrapSquare wrapText="largest"/>
-            <wp:docPr id="2" name="Image9"/>
+            <wp:docPr id="9" name="Image9"/>
             <wp:cNvGraphicFramePr>
               <a:graphicFrameLocks xmlns:a="http://schemas.openxmlformats.org/drawingml/2006/main" noChangeAspect="1"/>
             </wp:cNvGraphicFramePr>
@@ -980,13 +1513,13 @@
               <a:graphicData uri="http://schemas.openxmlformats.org/drawingml/2006/picture">
                 <pic:pic xmlns:pic="http://schemas.openxmlformats.org/drawingml/2006/picture">
                   <pic:nvPicPr>
-                    <pic:cNvPr id="2" name="Image9"/>
+                    <pic:cNvPr id="9" name="Image9"/>
                     <pic:cNvPicPr>
                       <a:picLocks noChangeAspect="1" noChangeArrowheads="1"/>
                     </pic:cNvPicPr>
                   </pic:nvPicPr>
                   <pic:blipFill>
-                    <a:blip r:embed="rId3"/>
+                    <a:blip r:embed="rId10"/>
                     <a:stretch>
                       <a:fillRect/>
                     </a:stretch>
@@ -1010,17 +1543,27 @@
     </w:p>
     <w:p>
       <w:pPr>
-        <w:pStyle w:val="Heading3"/>
-        <w:spacing w:lineRule="auto" w:line="274" w:before="0" w:after="140"/>
+        <w:pStyle w:val="BodyText"/>
+        <w:spacing w:lineRule="auto" w:line="271"/>
         <w:ind w:hanging="0"/>
-        <w:rPr>
-          <w:rFonts w:ascii="Google Sans;sans-serif" w:hAnsi="Google Sans;sans-serif"/>
-        </w:rPr>
-      </w:pPr>
-      <w:r>
-        <w:rPr>
-          <w:rFonts w:ascii="Google Sans;sans-serif" w:hAnsi="Google Sans;sans-serif"/>
-        </w:rPr>
+        <w:jc w:val="center"/>
+        <w:rPr/>
+      </w:pPr>
+      <w:r>
+        <w:rPr/>
+        <w:t xml:space="preserve">Figure </w:t>
+      </w:r>
+      <w:r>
+        <w:rPr/>
+        <w:t>2</w:t>
+      </w:r>
+      <w:r>
+        <w:rPr/>
+        <w:t xml:space="preserve">. </w:t>
+      </w:r>
+      <w:r>
+        <w:rPr/>
+        <w:t>Male AI interaction.</w:t>
       </w:r>
     </w:p>
     <w:p>
@@ -1488,7 +2031,7 @@
             <wp:extent cx="5293995" cy="5337810"/>
             <wp:effectExtent l="0" t="0" r="0" b="0"/>
             <wp:wrapTopAndBottom/>
-            <wp:docPr id="3" name="Image1"/>
+            <wp:docPr id="10" name="Image1"/>
             <wp:cNvGraphicFramePr>
               <a:graphicFrameLocks xmlns:a="http://schemas.openxmlformats.org/drawingml/2006/main" noChangeAspect="1"/>
             </wp:cNvGraphicFramePr>
@@ -1496,16 +2039,16 @@
               <a:graphicData uri="http://schemas.openxmlformats.org/drawingml/2006/picture">
                 <pic:pic xmlns:pic="http://schemas.openxmlformats.org/drawingml/2006/picture">
                   <pic:nvPicPr>
-                    <pic:cNvPr id="3" name="Image1"/>
+                    <pic:cNvPr id="10" name="Image1"/>
                     <pic:cNvPicPr>
                       <a:picLocks noChangeAspect="1" noChangeArrowheads="1"/>
                     </pic:cNvPicPr>
                   </pic:nvPicPr>
                   <pic:blipFill>
-                    <a:blip r:embed="rId4">
+                    <a:blip r:embed="rId11">
                       <a:extLst>
                         <a:ext uri="{96DAC541-7B7A-43D3-8B79-37D633B846F1}">
-                          <asvg:svgBlip xmlns:asvg="http://schemas.microsoft.com/office/drawing/2016/SVG/main" r:embed="rId5"/>
+                          <asvg:svgBlip xmlns:asvg="http://schemas.microsoft.com/office/drawing/2016/SVG/main" r:embed="rId12"/>
                         </a:ext>
                       </a:extLst>
                     </a:blip>
@@ -1546,7 +2089,19 @@
         <w:rPr>
           <w:rFonts w:ascii="Google Sans;sans-serif" w:hAnsi="Google Sans;sans-serif"/>
         </w:rPr>
-        <w:t>Figure 1. High-Level System Architecture Diagram.</w:t>
+        <w:t xml:space="preserve">Figure </w:t>
+      </w:r>
+      <w:r>
+        <w:rPr>
+          <w:rFonts w:ascii="Google Sans;sans-serif" w:hAnsi="Google Sans;sans-serif"/>
+        </w:rPr>
+        <w:t>3</w:t>
+      </w:r>
+      <w:r>
+        <w:rPr>
+          <w:rFonts w:ascii="Google Sans;sans-serif" w:hAnsi="Google Sans;sans-serif"/>
+        </w:rPr>
+        <w:t>. High-Level System Architecture Diagram.</w:t>
       </w:r>
     </w:p>
     <w:p>
@@ -1689,7 +2244,7 @@
           <wp:inline distT="0" distB="0" distL="0" distR="0">
             <wp:extent cx="6840220" cy="4536440"/>
             <wp:effectExtent l="0" t="0" r="0" b="0"/>
-            <wp:docPr id="4" name="圖片 1"/>
+            <wp:docPr id="11" name="圖片 1"/>
             <wp:cNvGraphicFramePr>
               <a:graphicFrameLocks xmlns:a="http://schemas.openxmlformats.org/drawingml/2006/main" noChangeAspect="1"/>
             </wp:cNvGraphicFramePr>
@@ -1697,13 +2252,13 @@
               <a:graphicData uri="http://schemas.openxmlformats.org/drawingml/2006/picture">
                 <pic:pic xmlns:pic="http://schemas.openxmlformats.org/drawingml/2006/picture">
                   <pic:nvPicPr>
-                    <pic:cNvPr id="4" name="圖片 1"/>
+                    <pic:cNvPr id="11" name="圖片 1"/>
                     <pic:cNvPicPr>
                       <a:picLocks noChangeAspect="1" noChangeArrowheads="1"/>
                     </pic:cNvPicPr>
                   </pic:nvPicPr>
                   <pic:blipFill>
-                    <a:blip r:embed="rId6"/>
+                    <a:blip r:embed="rId13"/>
                     <a:stretch>
                       <a:fillRect/>
                     </a:stretch>
@@ -1728,7 +2283,19 @@
         <w:rPr>
           <w:rFonts w:ascii="Google Sans;sans-serif" w:hAnsi="Google Sans;sans-serif"/>
         </w:rPr>
-        <w:t>Figure 2. System Deployment Diagram.</w:t>
+        <w:t xml:space="preserve">Figure </w:t>
+      </w:r>
+      <w:r>
+        <w:rPr>
+          <w:rFonts w:ascii="Google Sans;sans-serif" w:hAnsi="Google Sans;sans-serif"/>
+        </w:rPr>
+        <w:t>4</w:t>
+      </w:r>
+      <w:r>
+        <w:rPr>
+          <w:rFonts w:ascii="Google Sans;sans-serif" w:hAnsi="Google Sans;sans-serif"/>
+        </w:rPr>
+        <w:t>. System Deployment Diagram.</w:t>
       </w:r>
     </w:p>
     <w:p>
@@ -1833,7 +2400,7 @@
           <wp:inline distT="0" distB="0" distL="0" distR="0">
             <wp:extent cx="2115185" cy="7249795"/>
             <wp:effectExtent l="0" t="0" r="0" b="0"/>
-            <wp:docPr id="5" name="Image3"/>
+            <wp:docPr id="12" name="Image3"/>
             <wp:cNvGraphicFramePr>
               <a:graphicFrameLocks xmlns:a="http://schemas.openxmlformats.org/drawingml/2006/main" noChangeAspect="1"/>
             </wp:cNvGraphicFramePr>
@@ -1841,13 +2408,13 @@
               <a:graphicData uri="http://schemas.openxmlformats.org/drawingml/2006/picture">
                 <pic:pic xmlns:pic="http://schemas.openxmlformats.org/drawingml/2006/picture">
                   <pic:nvPicPr>
-                    <pic:cNvPr id="5" name="Image3"/>
+                    <pic:cNvPr id="12" name="Image3"/>
                     <pic:cNvPicPr>
                       <a:picLocks noChangeAspect="1" noChangeArrowheads="1"/>
                     </pic:cNvPicPr>
                   </pic:nvPicPr>
                   <pic:blipFill>
-                    <a:blip r:embed="rId7"/>
+                    <a:blip r:embed="rId14"/>
                     <a:stretch>
                       <a:fillRect/>
                     </a:stretch>
@@ -1881,7 +2448,19 @@
         <w:rPr>
           <w:rFonts w:ascii="Google Sans;sans-serif" w:hAnsi="Google Sans;sans-serif"/>
         </w:rPr>
-        <w:t>Figure 3. System Class Diagram and Entity Relationships.</w:t>
+        <w:t xml:space="preserve">Figure </w:t>
+      </w:r>
+      <w:r>
+        <w:rPr>
+          <w:rFonts w:ascii="Google Sans;sans-serif" w:hAnsi="Google Sans;sans-serif"/>
+        </w:rPr>
+        <w:t>5</w:t>
+      </w:r>
+      <w:r>
+        <w:rPr>
+          <w:rFonts w:ascii="Google Sans;sans-serif" w:hAnsi="Google Sans;sans-serif"/>
+        </w:rPr>
+        <w:t>. System Class Diagram and Entity Relationships.</w:t>
       </w:r>
     </w:p>
     <w:p>
@@ -3773,7 +4352,7 @@
             <wp:extent cx="6840220" cy="4770120"/>
             <wp:effectExtent l="0" t="0" r="0" b="0"/>
             <wp:wrapTopAndBottom/>
-            <wp:docPr id="6" name="Image4"/>
+            <wp:docPr id="13" name="Image4"/>
             <wp:cNvGraphicFramePr>
               <a:graphicFrameLocks xmlns:a="http://schemas.openxmlformats.org/drawingml/2006/main" noChangeAspect="1"/>
             </wp:cNvGraphicFramePr>
@@ -3781,16 +4360,16 @@
               <a:graphicData uri="http://schemas.openxmlformats.org/drawingml/2006/picture">
                 <pic:pic xmlns:pic="http://schemas.openxmlformats.org/drawingml/2006/picture">
                   <pic:nvPicPr>
-                    <pic:cNvPr id="6" name="Image4"/>
+                    <pic:cNvPr id="13" name="Image4"/>
                     <pic:cNvPicPr>
                       <a:picLocks noChangeAspect="1" noChangeArrowheads="1"/>
                     </pic:cNvPicPr>
                   </pic:nvPicPr>
                   <pic:blipFill>
-                    <a:blip r:embed="rId8">
+                    <a:blip r:embed="rId15">
                       <a:extLst>
                         <a:ext uri="{96DAC541-7B7A-43D3-8B79-37D633B846F1}">
-                          <asvg:svgBlip xmlns:asvg="http://schemas.microsoft.com/office/drawing/2016/SVG/main" r:embed="rId9"/>
+                          <asvg:svgBlip xmlns:asvg="http://schemas.microsoft.com/office/drawing/2016/SVG/main" r:embed="rId16"/>
                         </a:ext>
                       </a:extLst>
                     </a:blip>
@@ -3818,7 +4397,19 @@
         <w:rPr>
           <w:rFonts w:ascii="Google Sans;sans-serif" w:hAnsi="Google Sans;sans-serif"/>
         </w:rPr>
-        <w:t>Figure 4. User Registration Activity Flow.</w:t>
+        <w:t xml:space="preserve">Figure </w:t>
+      </w:r>
+      <w:r>
+        <w:rPr>
+          <w:rFonts w:ascii="Google Sans;sans-serif" w:hAnsi="Google Sans;sans-serif"/>
+        </w:rPr>
+        <w:t>6</w:t>
+      </w:r>
+      <w:r>
+        <w:rPr>
+          <w:rFonts w:ascii="Google Sans;sans-serif" w:hAnsi="Google Sans;sans-serif"/>
+        </w:rPr>
+        <w:t>. User Registration Activity Flow.</w:t>
       </w:r>
     </w:p>
     <w:p>
@@ -3856,7 +4447,7 @@
             <wp:extent cx="6762750" cy="5734050"/>
             <wp:effectExtent l="0" t="0" r="0" b="0"/>
             <wp:wrapTopAndBottom/>
-            <wp:docPr id="7" name="Image5"/>
+            <wp:docPr id="14" name="Image5"/>
             <wp:cNvGraphicFramePr>
               <a:graphicFrameLocks xmlns:a="http://schemas.openxmlformats.org/drawingml/2006/main" noChangeAspect="1"/>
             </wp:cNvGraphicFramePr>
@@ -3864,16 +4455,16 @@
               <a:graphicData uri="http://schemas.openxmlformats.org/drawingml/2006/picture">
                 <pic:pic xmlns:pic="http://schemas.openxmlformats.org/drawingml/2006/picture">
                   <pic:nvPicPr>
-                    <pic:cNvPr id="7" name="Image5"/>
+                    <pic:cNvPr id="14" name="Image5"/>
                     <pic:cNvPicPr>
                       <a:picLocks noChangeAspect="1" noChangeArrowheads="1"/>
                     </pic:cNvPicPr>
                   </pic:nvPicPr>
                   <pic:blipFill>
-                    <a:blip r:embed="rId10">
+                    <a:blip r:embed="rId17">
                       <a:extLst>
                         <a:ext uri="{96DAC541-7B7A-43D3-8B79-37D633B846F1}">
-                          <asvg:svgBlip xmlns:asvg="http://schemas.microsoft.com/office/drawing/2016/SVG/main" r:embed="rId11"/>
+                          <asvg:svgBlip xmlns:asvg="http://schemas.microsoft.com/office/drawing/2016/SVG/main" r:embed="rId18"/>
                         </a:ext>
                       </a:extLst>
                     </a:blip>
@@ -4129,17 +4720,202 @@
       <w:pPr>
         <w:pStyle w:val="BodyText"/>
         <w:spacing w:lineRule="auto" w:line="271"/>
-        <w:ind w:hanging="0"/>
-        <w:rPr>
-          <w:rFonts w:ascii="Google Sans;sans-serif" w:hAnsi="Google Sans;sans-serif"/>
-          <w:lang w:val="en-US"/>
-        </w:rPr>
-      </w:pPr>
-      <w:r>
-        <w:rPr>
-          <w:rFonts w:ascii="Google Sans;sans-serif" w:hAnsi="Google Sans;sans-serif"/>
-          <w:lang w:val="en-US"/>
-        </w:rPr>
+        <w:jc w:val="center"/>
+        <w:rPr/>
+      </w:pPr>
+      <w:r>
+        <w:drawing>
+          <wp:anchor distT="0" distB="0" distL="0" distR="0" simplePos="0" relativeHeight="19" behindDoc="0" locked="0" layoutInCell="0" allowOverlap="1">
+            <wp:simplePos x="0" y="0"/>
+            <wp:positionH relativeFrom="column">
+              <wp:align>center</wp:align>
+            </wp:positionH>
+            <wp:positionV relativeFrom="paragraph">
+              <wp:posOffset>635</wp:posOffset>
+            </wp:positionV>
+            <wp:extent cx="6840220" cy="4318000"/>
+            <wp:effectExtent l="0" t="0" r="0" b="0"/>
+            <wp:wrapTopAndBottom/>
+            <wp:docPr id="15" name="Image17"/>
+            <wp:cNvGraphicFramePr>
+              <a:graphicFrameLocks xmlns:a="http://schemas.openxmlformats.org/drawingml/2006/main" noChangeAspect="1"/>
+            </wp:cNvGraphicFramePr>
+            <a:graphic xmlns:a="http://schemas.openxmlformats.org/drawingml/2006/main">
+              <a:graphicData uri="http://schemas.openxmlformats.org/drawingml/2006/picture">
+                <pic:pic xmlns:pic="http://schemas.openxmlformats.org/drawingml/2006/picture">
+                  <pic:nvPicPr>
+                    <pic:cNvPr id="15" name="Image17"/>
+                    <pic:cNvPicPr>
+                      <a:picLocks noChangeAspect="1" noChangeArrowheads="1"/>
+                    </pic:cNvPicPr>
+                  </pic:nvPicPr>
+                  <pic:blipFill>
+                    <a:blip r:embed="rId19"/>
+                    <a:stretch>
+                      <a:fillRect/>
+                    </a:stretch>
+                  </pic:blipFill>
+                  <pic:spPr bwMode="auto">
+                    <a:xfrm>
+                      <a:off x="0" y="0"/>
+                      <a:ext cx="6840220" cy="4318000"/>
+                    </a:xfrm>
+                    <a:prstGeom prst="rect">
+                      <a:avLst/>
+                    </a:prstGeom>
+                    <a:noFill/>
+                  </pic:spPr>
+                </pic:pic>
+              </a:graphicData>
+            </a:graphic>
+          </wp:anchor>
+        </w:drawing>
+      </w:r>
+      <w:r>
+        <w:rPr/>
+        <w:t>Figure 5. User Registration Sequence Diagram.</w:t>
+      </w:r>
+    </w:p>
+    <w:p>
+      <w:pPr>
+        <w:pStyle w:val="BodyText"/>
+        <w:spacing w:lineRule="auto" w:line="271"/>
+        <w:jc w:val="center"/>
+        <w:rPr/>
+      </w:pPr>
+      <w:r>
+        <w:rPr/>
+      </w:r>
+    </w:p>
+    <w:p>
+      <w:pPr>
+        <w:pStyle w:val="BodyText"/>
+        <w:spacing w:lineRule="auto" w:line="271"/>
+        <w:jc w:val="center"/>
+        <w:rPr/>
+      </w:pPr>
+      <w:r>
+        <w:drawing>
+          <wp:anchor distT="0" distB="0" distL="0" distR="0" simplePos="0" relativeHeight="20" behindDoc="0" locked="0" layoutInCell="0" allowOverlap="1">
+            <wp:simplePos x="0" y="0"/>
+            <wp:positionH relativeFrom="column">
+              <wp:align>center</wp:align>
+            </wp:positionH>
+            <wp:positionV relativeFrom="paragraph">
+              <wp:posOffset>635</wp:posOffset>
+            </wp:positionV>
+            <wp:extent cx="6840220" cy="3267710"/>
+            <wp:effectExtent l="0" t="0" r="0" b="0"/>
+            <wp:wrapTopAndBottom/>
+            <wp:docPr id="16" name="Image18"/>
+            <wp:cNvGraphicFramePr>
+              <a:graphicFrameLocks xmlns:a="http://schemas.openxmlformats.org/drawingml/2006/main" noChangeAspect="1"/>
+            </wp:cNvGraphicFramePr>
+            <a:graphic xmlns:a="http://schemas.openxmlformats.org/drawingml/2006/main">
+              <a:graphicData uri="http://schemas.openxmlformats.org/drawingml/2006/picture">
+                <pic:pic xmlns:pic="http://schemas.openxmlformats.org/drawingml/2006/picture">
+                  <pic:nvPicPr>
+                    <pic:cNvPr id="16" name="Image18"/>
+                    <pic:cNvPicPr>
+                      <a:picLocks noChangeAspect="1" noChangeArrowheads="1"/>
+                    </pic:cNvPicPr>
+                  </pic:nvPicPr>
+                  <pic:blipFill>
+                    <a:blip r:embed="rId20"/>
+                    <a:stretch>
+                      <a:fillRect/>
+                    </a:stretch>
+                  </pic:blipFill>
+                  <pic:spPr bwMode="auto">
+                    <a:xfrm>
+                      <a:off x="0" y="0"/>
+                      <a:ext cx="6840220" cy="3267710"/>
+                    </a:xfrm>
+                    <a:prstGeom prst="rect">
+                      <a:avLst/>
+                    </a:prstGeom>
+                    <a:noFill/>
+                  </pic:spPr>
+                </pic:pic>
+              </a:graphicData>
+            </a:graphic>
+          </wp:anchor>
+        </w:drawing>
+      </w:r>
+      <w:r>
+        <w:rPr/>
+        <w:t>Figure 5. User Registration Sequence Diagram.</w:t>
+      </w:r>
+    </w:p>
+    <w:p>
+      <w:pPr>
+        <w:pStyle w:val="BodyText"/>
+        <w:spacing w:lineRule="auto" w:line="271"/>
+        <w:jc w:val="center"/>
+        <w:rPr/>
+      </w:pPr>
+      <w:r>
+        <w:rPr/>
+      </w:r>
+    </w:p>
+    <w:p>
+      <w:pPr>
+        <w:pStyle w:val="BodyText"/>
+        <w:spacing w:lineRule="auto" w:line="271"/>
+        <w:jc w:val="center"/>
+        <w:rPr/>
+      </w:pPr>
+      <w:r>
+        <w:drawing>
+          <wp:anchor distT="0" distB="0" distL="0" distR="0" simplePos="0" relativeHeight="21" behindDoc="0" locked="0" layoutInCell="0" allowOverlap="1">
+            <wp:simplePos x="0" y="0"/>
+            <wp:positionH relativeFrom="column">
+              <wp:posOffset>1362710</wp:posOffset>
+            </wp:positionH>
+            <wp:positionV relativeFrom="paragraph">
+              <wp:posOffset>-79375</wp:posOffset>
+            </wp:positionV>
+            <wp:extent cx="4114800" cy="4859020"/>
+            <wp:effectExtent l="0" t="0" r="0" b="0"/>
+            <wp:wrapTopAndBottom/>
+            <wp:docPr id="17" name="Image19"/>
+            <wp:cNvGraphicFramePr>
+              <a:graphicFrameLocks xmlns:a="http://schemas.openxmlformats.org/drawingml/2006/main" noChangeAspect="1"/>
+            </wp:cNvGraphicFramePr>
+            <a:graphic xmlns:a="http://schemas.openxmlformats.org/drawingml/2006/main">
+              <a:graphicData uri="http://schemas.openxmlformats.org/drawingml/2006/picture">
+                <pic:pic xmlns:pic="http://schemas.openxmlformats.org/drawingml/2006/picture">
+                  <pic:nvPicPr>
+                    <pic:cNvPr id="17" name="Image19"/>
+                    <pic:cNvPicPr>
+                      <a:picLocks noChangeAspect="1" noChangeArrowheads="1"/>
+                    </pic:cNvPicPr>
+                  </pic:nvPicPr>
+                  <pic:blipFill>
+                    <a:blip r:embed="rId21"/>
+                    <a:stretch>
+                      <a:fillRect/>
+                    </a:stretch>
+                  </pic:blipFill>
+                  <pic:spPr bwMode="auto">
+                    <a:xfrm>
+                      <a:off x="0" y="0"/>
+                      <a:ext cx="4114800" cy="4859020"/>
+                    </a:xfrm>
+                    <a:prstGeom prst="rect">
+                      <a:avLst/>
+                    </a:prstGeom>
+                    <a:noFill/>
+                  </pic:spPr>
+                </pic:pic>
+              </a:graphicData>
+            </a:graphic>
+          </wp:anchor>
+        </w:drawing>
+      </w:r>
+      <w:r>
+        <w:rPr/>
+        <w:t>Figure 5. User Registration Sequence Diagram.</w:t>
       </w:r>
     </w:p>
     <w:p>
@@ -4163,7 +4939,7 @@
             <wp:extent cx="6840220" cy="5329555"/>
             <wp:effectExtent l="0" t="0" r="0" b="0"/>
             <wp:wrapTopAndBottom/>
-            <wp:docPr id="8" name="Image6"/>
+            <wp:docPr id="18" name="Image6"/>
             <wp:cNvGraphicFramePr>
               <a:graphicFrameLocks xmlns:a="http://schemas.openxmlformats.org/drawingml/2006/main" noChangeAspect="1"/>
             </wp:cNvGraphicFramePr>
@@ -4171,16 +4947,16 @@
               <a:graphicData uri="http://schemas.openxmlformats.org/drawingml/2006/picture">
                 <pic:pic xmlns:pic="http://schemas.openxmlformats.org/drawingml/2006/picture">
                   <pic:nvPicPr>
-                    <pic:cNvPr id="8" name="Image6"/>
+                    <pic:cNvPr id="18" name="Image6"/>
                     <pic:cNvPicPr>
                       <a:picLocks noChangeAspect="1" noChangeArrowheads="1"/>
                     </pic:cNvPicPr>
                   </pic:nvPicPr>
                   <pic:blipFill>
-                    <a:blip r:embed="rId12">
+                    <a:blip r:embed="rId22">
                       <a:extLst>
                         <a:ext uri="{96DAC541-7B7A-43D3-8B79-37D633B846F1}">
-                          <asvg:svgBlip xmlns:asvg="http://schemas.microsoft.com/office/drawing/2016/SVG/main" r:embed="rId13"/>
+                          <asvg:svgBlip xmlns:asvg="http://schemas.microsoft.com/office/drawing/2016/SVG/main" r:embed="rId23"/>
                         </a:ext>
                       </a:extLst>
                     </a:blip>
@@ -4261,7 +5037,7 @@
             <wp:extent cx="6840220" cy="5782310"/>
             <wp:effectExtent l="0" t="0" r="0" b="0"/>
             <wp:wrapTopAndBottom/>
-            <wp:docPr id="9" name="Image7"/>
+            <wp:docPr id="19" name="Image7"/>
             <wp:cNvGraphicFramePr>
               <a:graphicFrameLocks xmlns:a="http://schemas.openxmlformats.org/drawingml/2006/main" noChangeAspect="1"/>
             </wp:cNvGraphicFramePr>
@@ -4269,16 +5045,16 @@
               <a:graphicData uri="http://schemas.openxmlformats.org/drawingml/2006/picture">
                 <pic:pic xmlns:pic="http://schemas.openxmlformats.org/drawingml/2006/picture">
                   <pic:nvPicPr>
-                    <pic:cNvPr id="9" name="Image7"/>
+                    <pic:cNvPr id="19" name="Image7"/>
                     <pic:cNvPicPr>
                       <a:picLocks noChangeAspect="1" noChangeArrowheads="1"/>
                     </pic:cNvPicPr>
                   </pic:nvPicPr>
                   <pic:blipFill>
-                    <a:blip r:embed="rId14">
+                    <a:blip r:embed="rId24">
                       <a:extLst>
                         <a:ext uri="{96DAC541-7B7A-43D3-8B79-37D633B846F1}">
-                          <asvg:svgBlip xmlns:asvg="http://schemas.microsoft.com/office/drawing/2016/SVG/main" r:embed="rId15"/>
+                          <asvg:svgBlip xmlns:asvg="http://schemas.microsoft.com/office/drawing/2016/SVG/main" r:embed="rId25"/>
                         </a:ext>
                       </a:extLst>
                     </a:blip>
@@ -4398,7 +5174,7 @@
             <wp:extent cx="5829300" cy="8924925"/>
             <wp:effectExtent l="0" t="0" r="0" b="0"/>
             <wp:wrapTopAndBottom/>
-            <wp:docPr id="10" name="Image8"/>
+            <wp:docPr id="20" name="Image8"/>
             <wp:cNvGraphicFramePr>
               <a:graphicFrameLocks xmlns:a="http://schemas.openxmlformats.org/drawingml/2006/main" noChangeAspect="1"/>
             </wp:cNvGraphicFramePr>
@@ -4406,16 +5182,16 @@
               <a:graphicData uri="http://schemas.openxmlformats.org/drawingml/2006/picture">
                 <pic:pic xmlns:pic="http://schemas.openxmlformats.org/drawingml/2006/picture">
                   <pic:nvPicPr>
-                    <pic:cNvPr id="10" name="Image8"/>
+                    <pic:cNvPr id="20" name="Image8"/>
                     <pic:cNvPicPr>
                       <a:picLocks noChangeAspect="1" noChangeArrowheads="1"/>
                     </pic:cNvPicPr>
                   </pic:nvPicPr>
                   <pic:blipFill>
-                    <a:blip r:embed="rId16">
+                    <a:blip r:embed="rId26">
                       <a:extLst>
                         <a:ext uri="{96DAC541-7B7A-43D3-8B79-37D633B846F1}">
-                          <asvg:svgBlip xmlns:asvg="http://schemas.microsoft.com/office/drawing/2016/SVG/main" r:embed="rId17"/>
+                          <asvg:svgBlip xmlns:asvg="http://schemas.microsoft.com/office/drawing/2016/SVG/main" r:embed="rId27"/>
                         </a:ext>
                       </a:extLst>
                     </a:blip>
@@ -5570,9 +6346,9 @@
       </w:r>
     </w:p>
     <w:sectPr>
-      <w:headerReference w:type="even" r:id="rId18"/>
-      <w:headerReference w:type="default" r:id="rId19"/>
-      <w:headerReference w:type="first" r:id="rId20"/>
+      <w:headerReference w:type="even" r:id="rId28"/>
+      <w:headerReference w:type="default" r:id="rId29"/>
+      <w:headerReference w:type="first" r:id="rId30"/>
       <w:type w:val="nextPage"/>
       <w:pgSz w:w="11906" w:h="16838"/>
       <w:pgMar w:left="567" w:right="567" w:gutter="0" w:header="567" w:top="1401" w:footer="0" w:bottom="567"/>
@@ -5621,7 +6397,7 @@
     </w:r>
     <w:r>
       <w:rPr/>
-      <w:t>19</w:t>
+      <w:t>25</w:t>
     </w:r>
     <w:r>
       <w:rPr/>
@@ -5653,7 +6429,7 @@
     </w:r>
     <w:r>
       <w:rPr/>
-      <w:t>19</w:t>
+      <w:t>25</w:t>
     </w:r>
     <w:r>
       <w:rPr/>

</xml_diff>